<commit_message>
Final corrections to supplemental materials II
</commit_message>
<xml_diff>
--- a/code/08_supplemental/doc_style_reference.docx
+++ b/code/08_supplemental/doc_style_reference.docx
@@ -24,6 +24,7 @@
       </w:pPr>
       <w:bookmarkStart w:id="0" w:name="yield"/>
       <w:r>
+        <w:lastRenderedPageBreak/>
         <w:t>Heading 1</w:t>
       </w:r>
     </w:p>
@@ -73,7 +74,6 @@
             <w:tr>
               <w:trPr>
                 <w:cnfStyle w:val="100000000000" w:firstRow="1" w:lastRow="0" w:firstColumn="0" w:lastColumn="0" w:oddVBand="0" w:evenVBand="0" w:oddHBand="0" w:evenHBand="0" w:firstRowFirstColumn="0" w:firstRowLastColumn="0" w:lastRowFirstColumn="0" w:lastRowLastColumn="0"/>
-                <w:cantSplit/>
                 <w:jc w:val="center"/>
               </w:trPr>
               <w:tc>
@@ -312,7 +312,6 @@
             </w:tr>
             <w:tr>
               <w:trPr>
-                <w:cantSplit/>
                 <w:jc w:val="center"/>
               </w:trPr>
               <w:tc>
@@ -551,7 +550,6 @@
             </w:tr>
             <w:tr>
               <w:trPr>
-                <w:cantSplit/>
                 <w:jc w:val="center"/>
               </w:trPr>
               <w:tc>
@@ -790,7 +788,6 @@
             </w:tr>
             <w:tr>
               <w:trPr>
-                <w:cantSplit/>
                 <w:jc w:val="center"/>
               </w:trPr>
               <w:tc>
@@ -1029,7 +1026,6 @@
             </w:tr>
             <w:tr>
               <w:trPr>
-                <w:cantSplit/>
                 <w:jc w:val="center"/>
               </w:trPr>
               <w:tc>
@@ -1268,7 +1264,6 @@
             </w:tr>
             <w:tr>
               <w:trPr>
-                <w:cantSplit/>
                 <w:jc w:val="center"/>
               </w:trPr>
               <w:tc>
@@ -1507,7 +1502,6 @@
             </w:tr>
             <w:tr>
               <w:trPr>
-                <w:cantSplit/>
                 <w:jc w:val="center"/>
               </w:trPr>
               <w:tc>
@@ -1746,7 +1740,6 @@
             </w:tr>
             <w:tr>
               <w:trPr>
-                <w:cantSplit/>
                 <w:jc w:val="center"/>
               </w:trPr>
               <w:tc>
@@ -1985,7 +1978,6 @@
             </w:tr>
             <w:tr>
               <w:trPr>
-                <w:cantSplit/>
                 <w:jc w:val="center"/>
               </w:trPr>
               <w:tc>
@@ -2224,7 +2216,6 @@
             </w:tr>
             <w:tr>
               <w:trPr>
-                <w:cantSplit/>
                 <w:jc w:val="center"/>
               </w:trPr>
               <w:tc>
@@ -2955,10 +2946,11 @@
     <w:link w:val="Heading1Char"/>
     <w:uiPriority w:val="9"/>
     <w:qFormat/>
-    <w:rsid w:val="00A10FD9"/>
+    <w:rsid w:val="00232477"/>
     <w:pPr>
       <w:keepNext/>
       <w:keepLines/>
+      <w:pageBreakBefore/>
       <w:spacing w:before="360" w:after="80"/>
       <w:outlineLvl w:val="0"/>
     </w:pPr>
@@ -3326,7 +3318,7 @@
     <w:basedOn w:val="DefaultParagraphFont"/>
     <w:link w:val="Heading1"/>
     <w:uiPriority w:val="9"/>
-    <w:rsid w:val="00A10FD9"/>
+    <w:rsid w:val="00232477"/>
     <w:rPr>
       <w:rFonts w:asciiTheme="majorHAnsi" w:eastAsiaTheme="majorEastAsia" w:hAnsiTheme="majorHAnsi" w:cstheme="majorBidi"/>
       <w:color w:val="0F4761" w:themeColor="accent1" w:themeShade="BF"/>
@@ -3485,6 +3477,9 @@
         <w:right w:w="108" w:type="dxa"/>
       </w:tblCellMar>
     </w:tblPr>
+    <w:trPr>
+      <w:cantSplit/>
+    </w:trPr>
     <w:tblStylePr w:type="firstRow">
       <w:tblPr>
         <w:jc w:val="left"/>

</xml_diff>